<commit_message>
snat, dnat, doku folytatasa
ASA0-ban dnat a webszerverre (192.168.10.21) es snat az irodai tartomanynak public net fele
</commit_message>
<xml_diff>
--- a/projektfeladat.docx
+++ b/projektfeladat.docx
@@ -187,7 +187,26 @@
         <w:rPr/>
       </w:pPr>
       <w:r>
-        <w:rPr>
+        <w:br w:type="page"/>
+      </w:r>
+      <w:r>
+        <w:rPr>
+          <w:rtl w:val="0"/>
+        </w:rPr>
+      </w:r>
+    </w:p>
+    <w:p>
+      <w:pPr>
+        <w:ind w:left="850.3937007874017" w:firstLine="0"/>
+        <w:rPr>
+          <w:sz w:val="28"/>
+          <w:szCs w:val="28"/>
+        </w:rPr>
+      </w:pPr>
+      <w:r>
+        <w:rPr>
+          <w:sz w:val="28"/>
+          <w:szCs w:val="28"/>
           <w:rtl w:val="0"/>
         </w:rPr>
         <w:t xml:space="preserve">Topológiai vázlat</w:t>
@@ -270,9 +289,17 @@
       </w:pPr>
       <w:r>
         <w:rPr>
-          <w:rtl w:val="0"/>
-        </w:rPr>
-        <w:t xml:space="preserve">VLANok:</w:t>
+          <w:b w:val="1"/>
+          <w:bCs w:val="1"/>
+          <w:rtl w:val="0"/>
+        </w:rPr>
+        <w:t xml:space="preserve">VLANok</w:t>
+      </w:r>
+      <w:r>
+        <w:rPr>
+          <w:rtl w:val="0"/>
+        </w:rPr>
+        <w:t xml:space="preserve">:</w:t>
       </w:r>
     </w:p>
     <w:p>
@@ -470,8 +497,17 @@
       </w:pPr>
       <w:r>
         <w:rPr>
-          <w:rtl w:val="0"/>
-        </w:rPr>
+          <w:b w:val="1"/>
+          <w:bCs w:val="1"/>
+          <w:rtl w:val="0"/>
+        </w:rPr>
+        <w:t xml:space="preserve">Vezeték nélküli hálózat: </w:t>
+      </w:r>
+      <w:r>
+        <w:rPr>
+          <w:rtl w:val="0"/>
+        </w:rPr>
+        <w:t xml:space="preserve">A raktárban telepítettünk egy WLAN AP-t a raktárkészlet követésére használt, vonalkódolvasóval ellátott  mobileszköz csatlakoztatásához.</w:t>
       </w:r>
     </w:p>
     <w:p>
@@ -515,6 +551,14 @@
       </w:pPr>
       <w:r>
         <w:rPr>
+          <w:b w:val="1"/>
+          <w:bCs w:val="1"/>
+          <w:rtl w:val="0"/>
+        </w:rPr>
+        <w:t xml:space="preserve">WAN kapcsolat: </w:t>
+      </w:r>
+      <w:r>
+        <w:rPr>
           <w:rtl w:val="0"/>
         </w:rPr>
         <w:t xml:space="preserve">A rendszer internetre csatlakozása a pécsi telephelyen valósul meg az ASA0 5505-ön keresztül.</w:t>
@@ -552,7 +596,7 @@
         <w:rPr>
           <w:rtl w:val="0"/>
         </w:rPr>
-        <w:t xml:space="preserve">A home office munkahelyen az ASA1 látja el a tűzfal és VPN szolgáltatást, szintén kézzel konfigurált publikus IP-je van outside oldalon.</w:t>
+        <w:t xml:space="preserve"> A home office munkahelyen az ASA1 látja el a tűzfal és VPN szolgáltatást, szintén   kézzel konfigurált publikus IP-je van outside oldalon.</w:t>
       </w:r>
     </w:p>
     <w:p>
@@ -575,7 +619,6 @@
         <w:rPr>
           <w:rtl w:val="0"/>
         </w:rPr>
-        <w:t xml:space="preserve">Az eszközökben 2 felhasználó lett létrehozva, elkülönítve a beállítási és az automatikus mentési hozzáférést.</w:t>
       </w:r>
     </w:p>
     <w:p>
@@ -587,7 +630,54 @@
         <w:rPr>
           <w:rtl w:val="0"/>
         </w:rPr>
-        <w:t xml:space="preserve">admin - 1234</w:t>
+      </w:r>
+    </w:p>
+    <w:p>
+      <w:pPr>
+        <w:ind w:left="850.3937007874017" w:firstLine="0"/>
+        <w:rPr>
+          <w:b w:val="1"/>
+          <w:bCs w:val="1"/>
+        </w:rPr>
+      </w:pPr>
+      <w:r>
+        <w:br w:type="page"/>
+      </w:r>
+      <w:r>
+        <w:rPr>
+          <w:rtl w:val="0"/>
+        </w:rPr>
+      </w:r>
+    </w:p>
+    <w:p>
+      <w:pPr>
+        <w:ind w:left="850.3937007874017" w:firstLine="0"/>
+        <w:rPr>
+          <w:b w:val="1"/>
+          <w:bCs w:val="1"/>
+        </w:rPr>
+      </w:pPr>
+      <w:r>
+        <w:rPr>
+          <w:b w:val="1"/>
+          <w:bCs w:val="1"/>
+          <w:rtl w:val="0"/>
+        </w:rPr>
+        <w:t xml:space="preserve">Statikus forgalomirányítás:</w:t>
+      </w:r>
+    </w:p>
+    <w:p>
+      <w:pPr>
+        <w:ind w:left="850.3937007874017" w:firstLine="0"/>
+        <w:rPr>
+          <w:b w:val="1"/>
+          <w:bCs w:val="1"/>
+        </w:rPr>
+      </w:pPr>
+      <w:r>
+        <w:rPr>
+          <w:rtl w:val="0"/>
+        </w:rPr>
       </w:r>
     </w:p>
     <w:p>
@@ -599,7 +689,7 @@
         <w:rPr>
           <w:rtl w:val="0"/>
         </w:rPr>
-        <w:t xml:space="preserve">backup - 5678</w:t>
+        <w:t xml:space="preserve">R1:</w:t>
       </w:r>
     </w:p>
     <w:p>
@@ -622,6 +712,7 @@
         <w:rPr>
           <w:rtl w:val="0"/>
         </w:rPr>
+        <w:t xml:space="preserve">ip route 192.168.88.0 255.255.255.0 10.20.0.1 </w:t>
       </w:r>
     </w:p>
     <w:p>
@@ -630,8 +721,451 @@
         <w:rPr/>
       </w:pPr>
       <w:r>
-        <w:br w:type="page"/>
-      </w:r>
+        <w:rPr>
+          <w:rtl w:val="0"/>
+        </w:rPr>
+        <w:t xml:space="preserve">A VPN-en keresztül csatlakozó home office munkahely tartománya az ASA0 felé érhető el.</w:t>
+      </w:r>
+    </w:p>
+    <w:p>
+      <w:pPr>
+        <w:ind w:left="850.3937007874017" w:firstLine="0"/>
+        <w:rPr/>
+      </w:pPr>
+      <w:r>
+        <w:rPr>
+          <w:rtl w:val="0"/>
+        </w:rPr>
+      </w:r>
+    </w:p>
+    <w:p>
+      <w:pPr>
+        <w:ind w:left="850.3937007874017" w:firstLine="0"/>
+        <w:rPr/>
+      </w:pPr>
+      <w:r>
+        <w:rPr>
+          <w:b w:val="1"/>
+          <w:bCs w:val="1"/>
+          <w:rtl w:val="0"/>
+        </w:rPr>
+        <w:t xml:space="preserve">A második rétegbeli redundanciát</w:t>
+      </w:r>
+      <w:r>
+        <w:rPr>
+          <w:rtl w:val="0"/>
+        </w:rPr>
+        <w:t xml:space="preserve"> az SW11-SW12 összekötése biztosítja, STP alapértelmezetten bontja ezt az útvonalat, az SW10 prioritása alacsonyabb, mint az SW11-12 eszközöké.</w:t>
+      </w:r>
+    </w:p>
+    <w:p>
+      <w:pPr>
+        <w:ind w:left="850.3937007874017" w:firstLine="0"/>
+        <w:rPr/>
+      </w:pPr>
+      <w:r>
+        <w:rPr>
+          <w:rtl w:val="0"/>
+        </w:rPr>
+      </w:r>
+    </w:p>
+    <w:p>
+      <w:pPr>
+        <w:ind w:left="850.3937007874017" w:firstLine="0"/>
+        <w:rPr/>
+      </w:pPr>
+      <w:r>
+        <w:rPr>
+          <w:rtl w:val="0"/>
+        </w:rPr>
+        <w:t xml:space="preserve">SW10: </w:t>
+        <w:tab/>
+        <w:t xml:space="preserve">spanning-tree vlan 10-13 priority 24576</w:t>
+      </w:r>
+    </w:p>
+    <w:p>
+      <w:pPr>
+        <w:ind w:left="850.3937007874017" w:firstLine="0"/>
+        <w:rPr/>
+      </w:pPr>
+      <w:r>
+        <w:rPr>
+          <w:rtl w:val="0"/>
+        </w:rPr>
+        <w:t xml:space="preserve">SW11-12: </w:t>
+        <w:tab/>
+        <w:t xml:space="preserve">spanning-tree vlan 10-13 priority 28672</w:t>
+      </w:r>
+    </w:p>
+    <w:p>
+      <w:pPr>
+        <w:ind w:left="850.3937007874017" w:firstLine="0"/>
+        <w:rPr/>
+      </w:pPr>
+      <w:r>
+        <w:rPr>
+          <w:rtl w:val="0"/>
+        </w:rPr>
+      </w:r>
+    </w:p>
+    <w:p>
+      <w:pPr>
+        <w:ind w:left="850.3937007874017" w:firstLine="0"/>
+        <w:rPr/>
+      </w:pPr>
+      <w:r>
+        <w:rPr>
+          <w:b w:val="1"/>
+          <w:bCs w:val="1"/>
+          <w:rtl w:val="0"/>
+        </w:rPr>
+        <w:t xml:space="preserve">A harmadik rétegbeli redundanciát, dinamikus forgalomirányítást  OSPF</w:t>
+      </w:r>
+      <w:r>
+        <w:rPr>
+          <w:rtl w:val="0"/>
+        </w:rPr>
+        <w:t xml:space="preserve">-el valósítottuk meg a telephelyek bérelt vonalas összekötésén keresztül.</w:t>
+      </w:r>
+    </w:p>
+    <w:p>
+      <w:pPr>
+        <w:ind w:left="850.3937007874017" w:firstLine="0"/>
+        <w:rPr/>
+      </w:pPr>
+      <w:r>
+        <w:rPr>
+          <w:rtl w:val="0"/>
+        </w:rPr>
+      </w:r>
+    </w:p>
+    <w:p>
+      <w:pPr>
+        <w:ind w:left="850.3937007874017" w:firstLine="0"/>
+        <w:rPr/>
+      </w:pPr>
+      <w:r>
+        <w:rPr>
+          <w:rtl w:val="0"/>
+        </w:rPr>
+        <w:t xml:space="preserve">R1:</w:t>
+      </w:r>
+    </w:p>
+    <w:p>
+      <w:pPr>
+        <w:ind w:left="850.3937007874017" w:firstLine="0"/>
+        <w:rPr/>
+      </w:pPr>
+      <w:r>
+        <w:rPr>
+          <w:rtl w:val="0"/>
+        </w:rPr>
+        <w:t xml:space="preserve">router ospf 1</w:t>
+      </w:r>
+    </w:p>
+    <w:p>
+      <w:pPr>
+        <w:ind w:left="850.3937007874017" w:firstLine="0"/>
+        <w:rPr/>
+      </w:pPr>
+      <w:r>
+        <w:rPr>
+          <w:rtl w:val="0"/>
+        </w:rPr>
+        <w:t xml:space="preserve"> router-id 1.1.1.1</w:t>
+      </w:r>
+    </w:p>
+    <w:p>
+      <w:pPr>
+        <w:ind w:left="850.3937007874017" w:firstLine="0"/>
+        <w:rPr/>
+      </w:pPr>
+      <w:r>
+        <w:rPr>
+          <w:rtl w:val="0"/>
+        </w:rPr>
+        <w:t xml:space="preserve"> log-adjacency-changes</w:t>
+      </w:r>
+    </w:p>
+    <w:p>
+      <w:pPr>
+        <w:ind w:left="850.3937007874017" w:firstLine="0"/>
+        <w:rPr/>
+      </w:pPr>
+      <w:r>
+        <w:rPr>
+          <w:rtl w:val="0"/>
+        </w:rPr>
+        <w:t xml:space="preserve"> network 10.10.10.0 0.0.0.3 area 0</w:t>
+      </w:r>
+    </w:p>
+    <w:p>
+      <w:pPr>
+        <w:ind w:left="850.3937007874017" w:firstLine="0"/>
+        <w:rPr/>
+      </w:pPr>
+      <w:r>
+        <w:rPr>
+          <w:rtl w:val="0"/>
+        </w:rPr>
+        <w:t xml:space="preserve"> network 10.20.20.0 0.0.0.3 area 0</w:t>
+      </w:r>
+    </w:p>
+    <w:p>
+      <w:pPr>
+        <w:ind w:left="850.3937007874017" w:firstLine="0"/>
+        <w:rPr/>
+      </w:pPr>
+      <w:r>
+        <w:rPr>
+          <w:rtl w:val="0"/>
+        </w:rPr>
+        <w:t xml:space="preserve"> network 10.10.20.0 0.0.0.3 area 0</w:t>
+      </w:r>
+    </w:p>
+    <w:p>
+      <w:pPr>
+        <w:ind w:left="850.3937007874017" w:firstLine="0"/>
+        <w:rPr/>
+      </w:pPr>
+      <w:r>
+        <w:rPr>
+          <w:rtl w:val="0"/>
+        </w:rPr>
+        <w:t xml:space="preserve"> network 192.168.10.0 0.0.0.255 area 0</w:t>
+      </w:r>
+    </w:p>
+    <w:p>
+      <w:pPr>
+        <w:ind w:left="850.3937007874017" w:firstLine="0"/>
+        <w:rPr/>
+      </w:pPr>
+      <w:r>
+        <w:rPr>
+          <w:rtl w:val="0"/>
+        </w:rPr>
+        <w:t xml:space="preserve"> network 192.168.11.0 0.0.0.255 area 0</w:t>
+      </w:r>
+    </w:p>
+    <w:p>
+      <w:pPr>
+        <w:ind w:left="850.3937007874017" w:firstLine="0"/>
+        <w:rPr/>
+      </w:pPr>
+      <w:r>
+        <w:rPr>
+          <w:rtl w:val="0"/>
+        </w:rPr>
+        <w:t xml:space="preserve"> network 192.168.12.0 0.0.0.255 area 0</w:t>
+      </w:r>
+    </w:p>
+    <w:p>
+      <w:pPr>
+        <w:ind w:left="850.3937007874017" w:firstLine="0"/>
+        <w:rPr/>
+      </w:pPr>
+      <w:r>
+        <w:rPr>
+          <w:rtl w:val="0"/>
+        </w:rPr>
+        <w:t xml:space="preserve"> network 192.168.13.0 0.0.0.255 area 0</w:t>
+      </w:r>
+    </w:p>
+    <w:p>
+      <w:pPr>
+        <w:ind w:left="850.3937007874017" w:firstLine="0"/>
+        <w:rPr/>
+      </w:pPr>
+      <w:r>
+        <w:rPr>
+          <w:rtl w:val="0"/>
+        </w:rPr>
+      </w:r>
+    </w:p>
+    <w:p>
+      <w:pPr>
+        <w:ind w:left="850.3937007874017" w:firstLine="0"/>
+        <w:rPr/>
+      </w:pPr>
+      <w:r>
+        <w:rPr>
+          <w:rtl w:val="0"/>
+        </w:rPr>
+        <w:t xml:space="preserve">R2:</w:t>
+      </w:r>
+    </w:p>
+    <w:p>
+      <w:pPr>
+        <w:ind w:left="850.3937007874017" w:firstLine="0"/>
+        <w:rPr/>
+      </w:pPr>
+      <w:r>
+        <w:rPr>
+          <w:rtl w:val="0"/>
+        </w:rPr>
+        <w:t xml:space="preserve">router ospf 1</w:t>
+      </w:r>
+    </w:p>
+    <w:p>
+      <w:pPr>
+        <w:ind w:left="850.3937007874017" w:firstLine="0"/>
+        <w:rPr/>
+      </w:pPr>
+      <w:r>
+        <w:rPr>
+          <w:rtl w:val="0"/>
+        </w:rPr>
+        <w:t xml:space="preserve"> router-id 2.2.2.2</w:t>
+      </w:r>
+    </w:p>
+    <w:p>
+      <w:pPr>
+        <w:ind w:left="850.3937007874017" w:firstLine="0"/>
+        <w:rPr/>
+      </w:pPr>
+      <w:r>
+        <w:rPr>
+          <w:rtl w:val="0"/>
+        </w:rPr>
+        <w:t xml:space="preserve"> log-adjacency-changes</w:t>
+      </w:r>
+    </w:p>
+    <w:p>
+      <w:pPr>
+        <w:ind w:left="850.3937007874017" w:firstLine="0"/>
+        <w:rPr/>
+      </w:pPr>
+      <w:r>
+        <w:rPr>
+          <w:rtl w:val="0"/>
+        </w:rPr>
+        <w:t xml:space="preserve"> network 10.10.10.0 0.0.0.3 area 0</w:t>
+      </w:r>
+    </w:p>
+    <w:p>
+      <w:pPr>
+        <w:ind w:left="850.3937007874017" w:firstLine="0"/>
+        <w:rPr/>
+      </w:pPr>
+      <w:r>
+        <w:rPr>
+          <w:rtl w:val="0"/>
+        </w:rPr>
+        <w:t xml:space="preserve"> network 10.10.30.0 0.0.0.3 area 0</w:t>
+      </w:r>
+    </w:p>
+    <w:p>
+      <w:pPr>
+        <w:ind w:left="850.3937007874017" w:firstLine="0"/>
+        <w:rPr/>
+      </w:pPr>
+      <w:r>
+        <w:rPr>
+          <w:rtl w:val="0"/>
+        </w:rPr>
+        <w:t xml:space="preserve"> network 192.168.21.0 0.0.0.255 area 0</w:t>
+      </w:r>
+    </w:p>
+    <w:p>
+      <w:pPr>
+        <w:ind w:left="850.3937007874017" w:firstLine="0"/>
+        <w:rPr/>
+      </w:pPr>
+      <w:r>
+        <w:rPr>
+          <w:rtl w:val="0"/>
+        </w:rPr>
+      </w:r>
+    </w:p>
+    <w:p>
+      <w:pPr>
+        <w:ind w:left="850.3937007874017" w:firstLine="0"/>
+        <w:rPr/>
+      </w:pPr>
+      <w:r>
+        <w:rPr>
+          <w:rtl w:val="0"/>
+        </w:rPr>
+        <w:t xml:space="preserve">R3:</w:t>
+      </w:r>
+    </w:p>
+    <w:p>
+      <w:pPr>
+        <w:ind w:left="850.3937007874017" w:firstLine="0"/>
+        <w:rPr/>
+      </w:pPr>
+      <w:r>
+        <w:rPr>
+          <w:rtl w:val="0"/>
+        </w:rPr>
+        <w:t xml:space="preserve">router ospf 1</w:t>
+      </w:r>
+    </w:p>
+    <w:p>
+      <w:pPr>
+        <w:ind w:left="850.3937007874017" w:firstLine="0"/>
+        <w:rPr/>
+      </w:pPr>
+      <w:r>
+        <w:rPr>
+          <w:rtl w:val="0"/>
+        </w:rPr>
+        <w:t xml:space="preserve"> router-id 3.3.3.3</w:t>
+      </w:r>
+    </w:p>
+    <w:p>
+      <w:pPr>
+        <w:ind w:left="850.3937007874017" w:firstLine="0"/>
+        <w:rPr/>
+      </w:pPr>
+      <w:r>
+        <w:rPr>
+          <w:rtl w:val="0"/>
+        </w:rPr>
+        <w:t xml:space="preserve"> log-adjacency-changes</w:t>
+      </w:r>
+    </w:p>
+    <w:p>
+      <w:pPr>
+        <w:ind w:left="850.3937007874017" w:firstLine="0"/>
+        <w:rPr/>
+      </w:pPr>
+      <w:r>
+        <w:rPr>
+          <w:rtl w:val="0"/>
+        </w:rPr>
+        <w:t xml:space="preserve"> network 10.10.20.0 0.0.0.3 area 0</w:t>
+      </w:r>
+    </w:p>
+    <w:p>
+      <w:pPr>
+        <w:ind w:left="850.3937007874017" w:firstLine="0"/>
+        <w:rPr/>
+      </w:pPr>
+      <w:r>
+        <w:rPr>
+          <w:rtl w:val="0"/>
+        </w:rPr>
+        <w:t xml:space="preserve"> network 10.10.30.0 0.0.0.3 area 0</w:t>
+      </w:r>
+    </w:p>
+    <w:p>
+      <w:pPr>
+        <w:ind w:left="850.3937007874017" w:firstLine="0"/>
+        <w:rPr/>
+      </w:pPr>
+      <w:r>
+        <w:rPr>
+          <w:rtl w:val="0"/>
+        </w:rPr>
+        <w:t xml:space="preserve"> network 192.168.31.0 0.0.0.255 area 0</w:t>
+      </w:r>
+    </w:p>
+    <w:p>
+      <w:pPr>
+        <w:ind w:left="850.3937007874017" w:firstLine="0"/>
+        <w:rPr/>
+      </w:pPr>
       <w:r>
         <w:rPr>
           <w:rtl w:val="0"/>
@@ -644,7 +1178,353 @@
         <w:rPr/>
       </w:pPr>
       <w:r>
-        <w:rPr>
+        <w:br w:type="page"/>
+      </w:r>
+      <w:r>
+        <w:rPr>
+          <w:rtl w:val="0"/>
+        </w:rPr>
+      </w:r>
+    </w:p>
+    <w:p>
+      <w:pPr>
+        <w:ind w:left="0" w:firstLine="0"/>
+        <w:rPr/>
+      </w:pPr>
+      <w:r>
+        <w:rPr>
+          <w:rtl w:val="0"/>
+        </w:rPr>
+        <w:tab/>
+        <w:t xml:space="preserve">Statikus címfordítás:</w:t>
+      </w:r>
+    </w:p>
+    <w:p>
+      <w:pPr>
+        <w:ind w:left="850.3937007874017" w:firstLine="0"/>
+        <w:rPr/>
+      </w:pPr>
+      <w:r>
+        <w:rPr>
+          <w:rtl w:val="0"/>
+        </w:rPr>
+        <w:t xml:space="preserve">A publikus IP cím 80-as portjára érkező kéréseket továbbítja a 192168.10.21 IP-re, ez a Windows server, ezen működik a cég webszervere.</w:t>
+      </w:r>
+    </w:p>
+    <w:p>
+      <w:pPr>
+        <w:ind w:left="0" w:firstLine="850.3937007874017"/>
+        <w:rPr/>
+      </w:pPr>
+      <w:r>
+        <w:rPr>
+          <w:rtl w:val="0"/>
+        </w:rPr>
+        <w:t xml:space="preserve">ASA0:</w:t>
+      </w:r>
+    </w:p>
+    <w:p>
+      <w:pPr>
+        <w:ind w:left="0" w:firstLine="0"/>
+        <w:rPr/>
+      </w:pPr>
+      <w:r>
+        <w:rPr>
+          <w:rtl w:val="0"/>
+        </w:rPr>
+        <w:tab/>
+        <w:tab/>
+        <w:t xml:space="preserve">object network WEB_SERVER</w:t>
+      </w:r>
+    </w:p>
+    <w:p>
+      <w:pPr>
+        <w:rPr/>
+      </w:pPr>
+      <w:r>
+        <w:rPr>
+          <w:rtl w:val="0"/>
+        </w:rPr>
+        <w:t xml:space="preserve"> </w:t>
+        <w:tab/>
+        <w:tab/>
+        <w:t xml:space="preserve">host 192.168.10.21</w:t>
+      </w:r>
+    </w:p>
+    <w:p>
+      <w:pPr>
+        <w:rPr>
+          <w:color w:val="ff0000"/>
+        </w:rPr>
+      </w:pPr>
+      <w:r>
+        <w:rPr>
+          <w:rtl w:val="0"/>
+        </w:rPr>
+        <w:t xml:space="preserve"> </w:t>
+        <w:tab/>
+        <w:tab/>
+        <w:t xml:space="preserve">nat (inside,outside) static 203.0.113.2 </w:t>
+      </w:r>
+      <w:r>
+        <w:rPr>
+          <w:color w:val="ff0000"/>
+          <w:rtl w:val="0"/>
+        </w:rPr>
+        <w:t xml:space="preserve">service tcp 80 80</w:t>
+      </w:r>
+    </w:p>
+    <w:p>
+      <w:pPr>
+        <w:rPr>
+          <w:color w:val="ff0000"/>
+        </w:rPr>
+      </w:pPr>
+      <w:r>
+        <w:rPr>
+          <w:color w:val="ff0000"/>
+          <w:rtl w:val="0"/>
+        </w:rPr>
+        <w:tab/>
+      </w:r>
+    </w:p>
+    <w:p>
+      <w:pPr>
+        <w:rPr/>
+      </w:pPr>
+      <w:r>
+        <w:rPr>
+          <w:color w:val="ff0000"/>
+          <w:rtl w:val="0"/>
+        </w:rPr>
+        <w:tab/>
+        <w:tab/>
+      </w:r>
+      <w:r>
+        <w:rPr>
+          <w:rtl w:val="0"/>
+        </w:rPr>
+        <w:t xml:space="preserve">a pirossal jelzett részletet nem fogadja el a packet tracer.</w:t>
+      </w:r>
+    </w:p>
+    <w:p>
+      <w:pPr>
+        <w:rPr/>
+      </w:pPr>
+      <w:r>
+        <w:rPr>
+          <w:rtl w:val="0"/>
+        </w:rPr>
+      </w:r>
+    </w:p>
+    <w:p>
+      <w:pPr>
+        <w:ind w:left="0" w:firstLine="0"/>
+        <w:rPr/>
+      </w:pPr>
+      <w:r>
+        <w:rPr>
+          <w:rtl w:val="0"/>
+        </w:rPr>
+        <w:tab/>
+        <w:t xml:space="preserve">Dinamikus címfordítás:</w:t>
+      </w:r>
+    </w:p>
+    <w:p>
+      <w:pPr>
+        <w:ind w:left="850.3937007874017" w:firstLine="0"/>
+        <w:rPr/>
+      </w:pPr>
+      <w:r>
+        <w:rPr>
+          <w:rtl w:val="0"/>
+        </w:rPr>
+        <w:t xml:space="preserve">Az irodai tartomány (192.168.11.0/24) számára internet elérést biztosít.</w:t>
+      </w:r>
+    </w:p>
+    <w:p>
+      <w:pPr>
+        <w:ind w:left="850.3937007874017" w:firstLine="0"/>
+        <w:rPr/>
+      </w:pPr>
+      <w:r>
+        <w:rPr>
+          <w:rtl w:val="0"/>
+        </w:rPr>
+        <w:t xml:space="preserve">ASA0:</w:t>
+      </w:r>
+    </w:p>
+    <w:p>
+      <w:pPr>
+        <w:ind w:left="0" w:firstLine="0"/>
+        <w:rPr/>
+      </w:pPr>
+      <w:r>
+        <w:rPr>
+          <w:rtl w:val="0"/>
+        </w:rPr>
+        <w:tab/>
+        <w:tab/>
+        <w:t xml:space="preserve">object network OFFICE_NET</w:t>
+      </w:r>
+    </w:p>
+    <w:p>
+      <w:pPr>
+        <w:rPr/>
+      </w:pPr>
+      <w:r>
+        <w:rPr>
+          <w:rtl w:val="0"/>
+        </w:rPr>
+        <w:t xml:space="preserve"> </w:t>
+        <w:tab/>
+        <w:tab/>
+        <w:t xml:space="preserve">subnet 192.168.11.0 255.255.255.0</w:t>
+      </w:r>
+    </w:p>
+    <w:p>
+      <w:pPr>
+        <w:rPr/>
+      </w:pPr>
+      <w:r>
+        <w:rPr>
+          <w:rtl w:val="0"/>
+        </w:rPr>
+        <w:t xml:space="preserve"> </w:t>
+        <w:tab/>
+        <w:tab/>
+        <w:t xml:space="preserve">nat (inside,outside) dynamic interface</w:t>
+      </w:r>
+    </w:p>
+    <w:p>
+      <w:pPr>
+        <w:ind w:left="0" w:firstLine="0"/>
+        <w:rPr/>
+      </w:pPr>
+      <w:r>
+        <w:rPr>
+          <w:rtl w:val="0"/>
+        </w:rPr>
+      </w:r>
+    </w:p>
+    <w:p>
+      <w:pPr>
+        <w:ind w:left="850.3937007874017" w:firstLine="0"/>
+        <w:rPr/>
+      </w:pPr>
+      <w:r>
+        <w:rPr>
+          <w:rtl w:val="0"/>
+        </w:rPr>
+      </w:r>
+    </w:p>
+    <w:p>
+      <w:pPr>
+        <w:ind w:left="0" w:firstLine="0"/>
+        <w:rPr/>
+      </w:pPr>
+      <w:r>
+        <w:rPr>
+          <w:rtl w:val="0"/>
+        </w:rPr>
+      </w:r>
+    </w:p>
+    <w:p>
+      <w:pPr>
+        <w:ind w:left="0" w:firstLine="0"/>
+        <w:rPr/>
+      </w:pPr>
+      <w:r>
+        <w:rPr>
+          <w:rtl w:val="0"/>
+        </w:rPr>
+        <w:tab/>
+      </w:r>
+    </w:p>
+    <w:p>
+      <w:pPr>
+        <w:ind w:left="850.3937007874017" w:firstLine="0"/>
+        <w:rPr/>
+      </w:pPr>
+      <w:r>
+        <w:rPr>
+          <w:rtl w:val="0"/>
+        </w:rPr>
+        <w:t xml:space="preserve">Az eszközökben 2 felhasználó lett létrehozva, elkülönítve a beállítási és az automatikus mentési hozzáférést.</w:t>
+      </w:r>
+    </w:p>
+    <w:p>
+      <w:pPr>
+        <w:ind w:left="850.3937007874017" w:firstLine="0"/>
+        <w:rPr/>
+      </w:pPr>
+      <w:r>
+        <w:rPr>
+          <w:rtl w:val="0"/>
+        </w:rPr>
+        <w:t xml:space="preserve">admin - 1234</w:t>
+      </w:r>
+    </w:p>
+    <w:p>
+      <w:pPr>
+        <w:ind w:left="850.3937007874017" w:firstLine="0"/>
+        <w:rPr/>
+      </w:pPr>
+      <w:r>
+        <w:rPr>
+          <w:rtl w:val="0"/>
+        </w:rPr>
+        <w:t xml:space="preserve">backup - 5678</w:t>
+      </w:r>
+    </w:p>
+    <w:p>
+      <w:pPr>
+        <w:ind w:left="850.3937007874017" w:firstLine="0"/>
+        <w:rPr/>
+      </w:pPr>
+      <w:r>
+        <w:rPr>
+          <w:rtl w:val="0"/>
+        </w:rPr>
+      </w:r>
+    </w:p>
+    <w:p>
+      <w:pPr>
+        <w:ind w:left="850.3937007874017" w:firstLine="0"/>
+        <w:rPr/>
+      </w:pPr>
+      <w:r>
+        <w:rPr>
+          <w:rtl w:val="0"/>
+        </w:rPr>
+      </w:r>
+    </w:p>
+    <w:p>
+      <w:pPr>
+        <w:ind w:left="850.3937007874017" w:firstLine="0"/>
+        <w:rPr/>
+      </w:pPr>
+      <w:r>
+        <w:br w:type="page"/>
+      </w:r>
+      <w:r>
+        <w:rPr>
+          <w:rtl w:val="0"/>
+        </w:rPr>
+      </w:r>
+    </w:p>
+    <w:p>
+      <w:pPr>
+        <w:ind w:left="0" w:firstLine="0"/>
+        <w:rPr>
+          <w:sz w:val="28"/>
+          <w:szCs w:val="28"/>
+        </w:rPr>
+      </w:pPr>
+      <w:r>
+        <w:rPr>
+          <w:sz w:val="28"/>
+          <w:szCs w:val="28"/>
           <w:rtl w:val="0"/>
         </w:rPr>
         <w:t xml:space="preserve">IP terv és eszközlista:</w:t>
@@ -10522,7 +11402,7 @@
     </w:p>
     <w:sectPr>
       <w:pgSz w:h="16834" w:w="11909" w:orient="portrait"/>
-      <w:pgMar w:bottom="1440" w:top="1440" w:left="1440" w:right="1440" w:header="720" w:footer="720"/>
+      <w:pgMar w:bottom="1440" w:top="1133.8582677165355" w:left="1440" w:right="1440" w:header="720" w:footer="720"/>
       <w:pgNumType w:start="1"/>
     </w:sectPr>
   </w:body>
@@ -11051,7 +11931,7 @@
 
 <file path=customXML/item1.xml><?xml version="1.0" encoding="utf-8"?>
 <go:gDocsCustomXmlDataStorage xmlns:go="http://customooxmlschemas.google.com/" xmlns:r="http://schemas.openxmlformats.org/officeDocument/2006/relationships" uri="GoogleDocsCustomDataVersion2">
-  <go:docsCustomData xmlns:go="http://customooxmlschemas.google.com/" roundtripDataSignature="AMtx7mhiGe7Tpo/zSiaClj49fUvmXX9x5w==">CgMxLjA4AHIhMVJXZVNRay1NVzY4NVlZUFBhNmZndnBKT3FQenZpZmo2</go:docsCustomData>
+  <go:docsCustomData xmlns:go="http://customooxmlschemas.google.com/" roundtripDataSignature="AMtx7mi/uIVMIKezCElNcjLivhaiGxA0DA==">CgMxLjA4AGolChRzdWdnZXN0Lnltb2dvaG9rdGxpcRINw4Frb3MgVmFkw6FzemokChNzdWdnZXN0Ljk4MWR5aWVuOXMxEg3DgWtvcyBWYWTDoXN6aiUKFHN1Z2dlc3QudW1sZHFkbGQ0eXc5Eg3DgWtvcyBWYWTDoXN6ciExUldlU1FrLU1XNjg1WVlQUGE2Zmd2cEpPcVB6dmlmajY=</go:docsCustomData>
 </go:gDocsCustomXmlDataStorage>
 </file>
 

</xml_diff>

<commit_message>
Dokumentacio folytatasa, packet tracer fizikai topologia kialakitasa
</commit_message>
<xml_diff>
--- a/projektfeladat.docx
+++ b/projektfeladat.docx
@@ -199,17 +199,35 @@
       <w:pPr>
         <w:ind w:left="850.3937007874017" w:firstLine="0"/>
         <w:rPr>
+          <w:b w:val="1"/>
+          <w:bCs w:val="1"/>
           <w:sz w:val="28"/>
           <w:szCs w:val="28"/>
         </w:rPr>
       </w:pPr>
       <w:r>
         <w:rPr>
+          <w:b w:val="1"/>
+          <w:bCs w:val="1"/>
           <w:sz w:val="28"/>
           <w:szCs w:val="28"/>
           <w:rtl w:val="0"/>
         </w:rPr>
-        <w:t xml:space="preserve">Topológiai vázlat</w:t>
+        <w:t xml:space="preserve">Topológiai vázlat:</w:t>
+      </w:r>
+    </w:p>
+    <w:p>
+      <w:pPr>
+        <w:ind w:left="850.3937007874017" w:firstLine="0"/>
+        <w:rPr>
+          <w:sz w:val="28"/>
+          <w:szCs w:val="28"/>
+        </w:rPr>
+      </w:pPr>
+      <w:r>
+        <w:rPr>
+          <w:rtl w:val="0"/>
+        </w:rPr>
       </w:r>
     </w:p>
     <w:p>
@@ -530,7 +548,7 @@
         <w:rPr>
           <w:rtl w:val="0"/>
         </w:rPr>
-        <w:t xml:space="preserve">A mohácsi és szigetvári telephelyeken csak bolt üzemel, azonos kialakításban. A telephelyi router bérelt vonalon csatlakozik a másik két telephelyhez, G0/0 portra csatlakozik a végpontokat kiszolgáló switch. Portok accessben.</w:t>
+        <w:t xml:space="preserve">A mohácsi és szigetvári telephelyeken csak bolt üzemel, azonos kialakításban. A telephelyi router bérelt vonalon csatlakozik a másik két telephelyhez, G0/0 portra csatlakozik a végpontokat kiszolgáló switch. Switchportok accessben.</w:t>
       </w:r>
     </w:p>
     <w:p>
@@ -1189,10 +1207,15 @@
     <w:p>
       <w:pPr>
         <w:ind w:left="0" w:firstLine="0"/>
-        <w:rPr/>
-      </w:pPr>
-      <w:r>
-        <w:rPr>
+        <w:rPr>
+          <w:b w:val="1"/>
+          <w:bCs w:val="1"/>
+        </w:rPr>
+      </w:pPr>
+      <w:r>
+        <w:rPr>
+          <w:b w:val="1"/>
+          <w:bCs w:val="1"/>
           <w:rtl w:val="0"/>
         </w:rPr>
         <w:tab/>
@@ -1320,10 +1343,15 @@
     <w:p>
       <w:pPr>
         <w:ind w:left="0" w:firstLine="0"/>
-        <w:rPr/>
-      </w:pPr>
-      <w:r>
-        <w:rPr>
+        <w:rPr>
+          <w:b w:val="1"/>
+          <w:bCs w:val="1"/>
+        </w:rPr>
+      </w:pPr>
+      <w:r>
+        <w:rPr>
+          <w:b w:val="1"/>
+          <w:bCs w:val="1"/>
           <w:rtl w:val="0"/>
         </w:rPr>
         <w:tab/>
@@ -1409,24 +1437,25 @@
     </w:p>
     <w:p>
       <w:pPr>
-        <w:ind w:left="850.3937007874017" w:firstLine="0"/>
-        <w:rPr/>
-      </w:pPr>
-      <w:r>
-        <w:rPr>
-          <w:rtl w:val="0"/>
-        </w:rPr>
-      </w:r>
-    </w:p>
-    <w:p>
-      <w:pPr>
         <w:ind w:left="0" w:firstLine="0"/>
-        <w:rPr/>
-      </w:pPr>
-      <w:r>
-        <w:rPr>
-          <w:rtl w:val="0"/>
-        </w:rPr>
+        <w:rPr>
+          <w:b w:val="1"/>
+          <w:bCs w:val="1"/>
+        </w:rPr>
+      </w:pPr>
+      <w:r>
+        <w:rPr>
+          <w:rtl w:val="0"/>
+        </w:rPr>
+        <w:tab/>
+      </w:r>
+      <w:r>
+        <w:rPr>
+          <w:b w:val="1"/>
+          <w:bCs w:val="1"/>
+          <w:rtl w:val="0"/>
+        </w:rPr>
+        <w:t xml:space="preserve">Helyi és távoli hozzáférés:</w:t>
       </w:r>
     </w:p>
     <w:p>
@@ -1462,6 +1491,18 @@
         <w:rPr>
           <w:rtl w:val="0"/>
         </w:rPr>
+        <w:t xml:space="preserve">username - password:</w:t>
+      </w:r>
+    </w:p>
+    <w:p>
+      <w:pPr>
+        <w:ind w:left="850.3937007874017" w:firstLine="0"/>
+        <w:rPr/>
+      </w:pPr>
+      <w:r>
+        <w:rPr>
+          <w:rtl w:val="0"/>
+        </w:rPr>
         <w:t xml:space="preserve">admin - 1234</w:t>
       </w:r>
     </w:p>
@@ -1475,6 +1516,926 @@
           <w:rtl w:val="0"/>
         </w:rPr>
         <w:t xml:space="preserve">backup - 5678</w:t>
+      </w:r>
+    </w:p>
+    <w:p>
+      <w:pPr>
+        <w:ind w:left="850.3937007874017" w:firstLine="0"/>
+        <w:rPr/>
+      </w:pPr>
+      <w:r>
+        <w:rPr>
+          <w:rtl w:val="0"/>
+        </w:rPr>
+      </w:r>
+    </w:p>
+    <w:p>
+      <w:pPr>
+        <w:ind w:left="0" w:firstLine="720"/>
+        <w:rPr>
+          <w:b w:val="1"/>
+          <w:bCs w:val="1"/>
+        </w:rPr>
+      </w:pPr>
+      <w:r>
+        <w:br w:type="page"/>
+      </w:r>
+      <w:r>
+        <w:rPr>
+          <w:rtl w:val="0"/>
+        </w:rPr>
+      </w:r>
+    </w:p>
+    <w:p>
+      <w:pPr>
+        <w:ind w:left="0" w:firstLine="720"/>
+        <w:rPr>
+          <w:b w:val="1"/>
+          <w:bCs w:val="1"/>
+        </w:rPr>
+      </w:pPr>
+      <w:r>
+        <w:rPr>
+          <w:b w:val="1"/>
+          <w:bCs w:val="1"/>
+          <w:rtl w:val="0"/>
+        </w:rPr>
+        <w:t xml:space="preserve">VPN kialakítása:</w:t>
+      </w:r>
+    </w:p>
+    <w:p>
+      <w:pPr>
+        <w:ind w:left="850.3937007874017" w:firstLine="0"/>
+        <w:rPr>
+          <w:b w:val="1"/>
+          <w:bCs w:val="1"/>
+        </w:rPr>
+      </w:pPr>
+      <w:r>
+        <w:rPr>
+          <w:rtl w:val="0"/>
+        </w:rPr>
+      </w:r>
+    </w:p>
+    <w:p>
+      <w:pPr>
+        <w:ind w:left="850.3937007874017" w:firstLine="0"/>
+        <w:rPr/>
+      </w:pPr>
+      <w:r>
+        <w:rPr>
+          <w:rtl w:val="0"/>
+        </w:rPr>
+        <w:t xml:space="preserve">ASA0, HQ:</w:t>
+      </w:r>
+    </w:p>
+    <w:p>
+      <w:pPr>
+        <w:ind w:left="850.3937007874017" w:firstLine="0"/>
+        <w:rPr/>
+      </w:pPr>
+      <w:r>
+        <w:rPr>
+          <w:rtl w:val="0"/>
+        </w:rPr>
+      </w:r>
+    </w:p>
+    <w:p>
+      <w:pPr>
+        <w:ind w:left="850.3937007874017" w:firstLine="0"/>
+        <w:rPr/>
+      </w:pPr>
+      <w:r>
+        <w:rPr>
+          <w:rtl w:val="0"/>
+        </w:rPr>
+        <w:t xml:space="preserve">crypto ipsec ikev1 transform-set VPN-SET esp-aes esp-sha-hmac</w:t>
+      </w:r>
+    </w:p>
+    <w:p>
+      <w:pPr>
+        <w:ind w:left="850.3937007874017" w:firstLine="0"/>
+        <w:rPr/>
+      </w:pPr>
+      <w:r>
+        <w:rPr>
+          <w:rtl w:val="0"/>
+        </w:rPr>
+        <w:t xml:space="preserve">!</w:t>
+      </w:r>
+    </w:p>
+    <w:p>
+      <w:pPr>
+        <w:ind w:left="850.3937007874017" w:firstLine="0"/>
+        <w:rPr/>
+      </w:pPr>
+      <w:r>
+        <w:rPr>
+          <w:rtl w:val="0"/>
+        </w:rPr>
+        <w:t xml:space="preserve">crypto map VPN-MAP 10 match address VPN-ACL</w:t>
+      </w:r>
+    </w:p>
+    <w:p>
+      <w:pPr>
+        <w:ind w:left="850.3937007874017" w:firstLine="0"/>
+        <w:rPr/>
+      </w:pPr>
+      <w:r>
+        <w:rPr>
+          <w:rtl w:val="0"/>
+        </w:rPr>
+        <w:t xml:space="preserve">crypto map VPN-MAP 10 set peer 203.0.113.3 </w:t>
+      </w:r>
+    </w:p>
+    <w:p>
+      <w:pPr>
+        <w:ind w:left="850.3937007874017" w:firstLine="0"/>
+        <w:rPr/>
+      </w:pPr>
+      <w:r>
+        <w:rPr>
+          <w:rtl w:val="0"/>
+        </w:rPr>
+        <w:t xml:space="preserve">crypto map VPN-MAP 10 set ikev1 transform-set VPN-SET </w:t>
+      </w:r>
+    </w:p>
+    <w:p>
+      <w:pPr>
+        <w:ind w:left="850.3937007874017" w:firstLine="0"/>
+        <w:rPr/>
+      </w:pPr>
+      <w:r>
+        <w:rPr>
+          <w:rtl w:val="0"/>
+        </w:rPr>
+        <w:t xml:space="preserve">crypto map VPN-MAP interface outside</w:t>
+      </w:r>
+    </w:p>
+    <w:p>
+      <w:pPr>
+        <w:ind w:left="850.3937007874017" w:firstLine="0"/>
+        <w:rPr/>
+      </w:pPr>
+      <w:r>
+        <w:rPr>
+          <w:rtl w:val="0"/>
+        </w:rPr>
+        <w:t xml:space="preserve">crypto ikev1 enable outside</w:t>
+      </w:r>
+    </w:p>
+    <w:p>
+      <w:pPr>
+        <w:ind w:left="850.3937007874017" w:firstLine="0"/>
+        <w:rPr/>
+      </w:pPr>
+      <w:r>
+        <w:rPr>
+          <w:rtl w:val="0"/>
+        </w:rPr>
+        <w:t xml:space="preserve">crypto ikev1 policy 10</w:t>
+      </w:r>
+    </w:p>
+    <w:p>
+      <w:pPr>
+        <w:ind w:left="850.3937007874017" w:firstLine="0"/>
+        <w:rPr/>
+      </w:pPr>
+      <w:r>
+        <w:rPr>
+          <w:rtl w:val="0"/>
+        </w:rPr>
+        <w:t xml:space="preserve"> encr aes</w:t>
+      </w:r>
+    </w:p>
+    <w:p>
+      <w:pPr>
+        <w:ind w:left="850.3937007874017" w:firstLine="0"/>
+        <w:rPr/>
+      </w:pPr>
+      <w:r>
+        <w:rPr>
+          <w:rtl w:val="0"/>
+        </w:rPr>
+        <w:t xml:space="preserve"> authentication pre-share</w:t>
+      </w:r>
+    </w:p>
+    <w:p>
+      <w:pPr>
+        <w:ind w:left="850.3937007874017" w:firstLine="0"/>
+        <w:rPr/>
+      </w:pPr>
+      <w:r>
+        <w:rPr>
+          <w:rtl w:val="0"/>
+        </w:rPr>
+        <w:t xml:space="preserve"> group 2</w:t>
+      </w:r>
+    </w:p>
+    <w:p>
+      <w:pPr>
+        <w:ind w:left="850.3937007874017" w:firstLine="0"/>
+        <w:rPr/>
+      </w:pPr>
+      <w:r>
+        <w:rPr>
+          <w:rtl w:val="0"/>
+        </w:rPr>
+        <w:t xml:space="preserve">!</w:t>
+      </w:r>
+    </w:p>
+    <w:p>
+      <w:pPr>
+        <w:ind w:left="850.3937007874017" w:firstLine="0"/>
+        <w:rPr/>
+      </w:pPr>
+      <w:r>
+        <w:rPr>
+          <w:rtl w:val="0"/>
+        </w:rPr>
+        <w:t xml:space="preserve">tunnel-group 203.0.113.3 type ipsec-l2l</w:t>
+      </w:r>
+    </w:p>
+    <w:p>
+      <w:pPr>
+        <w:ind w:left="850.3937007874017" w:firstLine="0"/>
+        <w:rPr/>
+      </w:pPr>
+      <w:r>
+        <w:rPr>
+          <w:rtl w:val="0"/>
+        </w:rPr>
+        <w:t xml:space="preserve">tunnel-group 203.0.113.3 ipsec-attributes</w:t>
+      </w:r>
+    </w:p>
+    <w:p>
+      <w:pPr>
+        <w:ind w:left="850.3937007874017" w:firstLine="0"/>
+        <w:rPr/>
+      </w:pPr>
+      <w:r>
+        <w:rPr>
+          <w:rtl w:val="0"/>
+        </w:rPr>
+        <w:t xml:space="preserve"> ikev1 pre-shared-key VPN123456</w:t>
+      </w:r>
+    </w:p>
+    <w:p>
+      <w:pPr>
+        <w:ind w:left="850.3937007874017" w:firstLine="0"/>
+        <w:rPr/>
+      </w:pPr>
+      <w:r>
+        <w:rPr>
+          <w:rtl w:val="0"/>
+        </w:rPr>
+        <w:t xml:space="preserve">!</w:t>
+      </w:r>
+    </w:p>
+    <w:p>
+      <w:pPr>
+        <w:ind w:left="850.3937007874017" w:firstLine="0"/>
+        <w:rPr/>
+      </w:pPr>
+      <w:r>
+        <w:rPr>
+          <w:rtl w:val="0"/>
+        </w:rPr>
+      </w:r>
+    </w:p>
+    <w:p>
+      <w:pPr>
+        <w:ind w:left="850.3937007874017" w:firstLine="0"/>
+        <w:rPr/>
+      </w:pPr>
+      <w:r>
+        <w:rPr>
+          <w:rtl w:val="0"/>
+        </w:rPr>
+        <w:t xml:space="preserve">ASA1, HomeOffice:</w:t>
+      </w:r>
+    </w:p>
+    <w:p>
+      <w:pPr>
+        <w:ind w:left="850.3937007874017" w:firstLine="0"/>
+        <w:rPr/>
+      </w:pPr>
+      <w:r>
+        <w:rPr>
+          <w:rtl w:val="0"/>
+        </w:rPr>
+      </w:r>
+    </w:p>
+    <w:p>
+      <w:pPr>
+        <w:ind w:left="850.3937007874017" w:firstLine="0"/>
+        <w:rPr/>
+      </w:pPr>
+      <w:r>
+        <w:rPr>
+          <w:rtl w:val="0"/>
+        </w:rPr>
+        <w:t xml:space="preserve">crypto ipsec ikev1 transform-set VPN-SET esp-aes esp-sha-hmac</w:t>
+      </w:r>
+    </w:p>
+    <w:p>
+      <w:pPr>
+        <w:ind w:left="850.3937007874017" w:firstLine="0"/>
+        <w:rPr/>
+      </w:pPr>
+      <w:r>
+        <w:rPr>
+          <w:rtl w:val="0"/>
+        </w:rPr>
+        <w:t xml:space="preserve">!</w:t>
+      </w:r>
+    </w:p>
+    <w:p>
+      <w:pPr>
+        <w:ind w:left="850.3937007874017" w:firstLine="0"/>
+        <w:rPr/>
+      </w:pPr>
+      <w:r>
+        <w:rPr>
+          <w:rtl w:val="0"/>
+        </w:rPr>
+        <w:t xml:space="preserve">crypto map VPN-MAP 10 match address VPN-ACL</w:t>
+      </w:r>
+    </w:p>
+    <w:p>
+      <w:pPr>
+        <w:ind w:left="850.3937007874017" w:firstLine="0"/>
+        <w:rPr/>
+      </w:pPr>
+      <w:r>
+        <w:rPr>
+          <w:rtl w:val="0"/>
+        </w:rPr>
+        <w:t xml:space="preserve">crypto map VPN-MAP 10 set peer 203.0.113.2 </w:t>
+      </w:r>
+    </w:p>
+    <w:p>
+      <w:pPr>
+        <w:ind w:left="850.3937007874017" w:firstLine="0"/>
+        <w:rPr/>
+      </w:pPr>
+      <w:r>
+        <w:rPr>
+          <w:rtl w:val="0"/>
+        </w:rPr>
+        <w:t xml:space="preserve">crypto map VPN-MAP 10 set ikev1 transform-set VPN-SET </w:t>
+      </w:r>
+    </w:p>
+    <w:p>
+      <w:pPr>
+        <w:ind w:left="850.3937007874017" w:firstLine="0"/>
+        <w:rPr/>
+      </w:pPr>
+      <w:r>
+        <w:rPr>
+          <w:rtl w:val="0"/>
+        </w:rPr>
+        <w:t xml:space="preserve">crypto map VPN-MAP interface outside</w:t>
+      </w:r>
+    </w:p>
+    <w:p>
+      <w:pPr>
+        <w:ind w:left="850.3937007874017" w:firstLine="0"/>
+        <w:rPr/>
+      </w:pPr>
+      <w:r>
+        <w:rPr>
+          <w:rtl w:val="0"/>
+        </w:rPr>
+        <w:t xml:space="preserve">crypto ikev1 enable outside</w:t>
+      </w:r>
+    </w:p>
+    <w:p>
+      <w:pPr>
+        <w:ind w:left="850.3937007874017" w:firstLine="0"/>
+        <w:rPr/>
+      </w:pPr>
+      <w:r>
+        <w:rPr>
+          <w:rtl w:val="0"/>
+        </w:rPr>
+        <w:t xml:space="preserve">crypto ikev1 policy 10</w:t>
+      </w:r>
+    </w:p>
+    <w:p>
+      <w:pPr>
+        <w:ind w:left="850.3937007874017" w:firstLine="0"/>
+        <w:rPr/>
+      </w:pPr>
+      <w:r>
+        <w:rPr>
+          <w:rtl w:val="0"/>
+        </w:rPr>
+        <w:t xml:space="preserve"> encr aes</w:t>
+      </w:r>
+    </w:p>
+    <w:p>
+      <w:pPr>
+        <w:ind w:left="850.3937007874017" w:firstLine="0"/>
+        <w:rPr/>
+      </w:pPr>
+      <w:r>
+        <w:rPr>
+          <w:rtl w:val="0"/>
+        </w:rPr>
+        <w:t xml:space="preserve"> authentication pre-share</w:t>
+      </w:r>
+    </w:p>
+    <w:p>
+      <w:pPr>
+        <w:ind w:left="850.3937007874017" w:firstLine="0"/>
+        <w:rPr/>
+      </w:pPr>
+      <w:r>
+        <w:rPr>
+          <w:rtl w:val="0"/>
+        </w:rPr>
+        <w:t xml:space="preserve"> group 2</w:t>
+      </w:r>
+    </w:p>
+    <w:p>
+      <w:pPr>
+        <w:ind w:left="850.3937007874017" w:firstLine="0"/>
+        <w:rPr/>
+      </w:pPr>
+      <w:r>
+        <w:rPr>
+          <w:rtl w:val="0"/>
+        </w:rPr>
+        <w:t xml:space="preserve">!</w:t>
+      </w:r>
+    </w:p>
+    <w:p>
+      <w:pPr>
+        <w:ind w:left="850.3937007874017" w:firstLine="0"/>
+        <w:rPr/>
+      </w:pPr>
+      <w:r>
+        <w:rPr>
+          <w:rtl w:val="0"/>
+        </w:rPr>
+        <w:t xml:space="preserve">tunnel-group 203.0.113.2 type ipsec-l2l</w:t>
+      </w:r>
+    </w:p>
+    <w:p>
+      <w:pPr>
+        <w:ind w:left="850.3937007874017" w:firstLine="0"/>
+        <w:rPr/>
+      </w:pPr>
+      <w:r>
+        <w:rPr>
+          <w:rtl w:val="0"/>
+        </w:rPr>
+        <w:t xml:space="preserve">tunnel-group 203.0.113.2 ipsec-attributes</w:t>
+      </w:r>
+    </w:p>
+    <w:p>
+      <w:pPr>
+        <w:ind w:left="850.3937007874017" w:firstLine="0"/>
+        <w:rPr/>
+      </w:pPr>
+      <w:r>
+        <w:rPr>
+          <w:rtl w:val="0"/>
+        </w:rPr>
+        <w:t xml:space="preserve"> ikev1 pre-shared-key VPN123456</w:t>
+      </w:r>
+    </w:p>
+    <w:p>
+      <w:pPr>
+        <w:ind w:left="850.3937007874017" w:firstLine="0"/>
+        <w:rPr/>
+      </w:pPr>
+      <w:r>
+        <w:rPr>
+          <w:rtl w:val="0"/>
+        </w:rPr>
+        <w:t xml:space="preserve">!</w:t>
+      </w:r>
+    </w:p>
+    <w:p>
+      <w:pPr>
+        <w:ind w:left="850.3937007874017" w:firstLine="0"/>
+        <w:rPr/>
+      </w:pPr>
+      <w:r>
+        <w:br w:type="page"/>
+      </w:r>
+      <w:r>
+        <w:rPr>
+          <w:rtl w:val="0"/>
+        </w:rPr>
+      </w:r>
+    </w:p>
+    <w:p>
+      <w:pPr>
+        <w:ind w:left="850.3937007874017" w:firstLine="0"/>
+        <w:rPr>
+          <w:b w:val="1"/>
+          <w:bCs w:val="1"/>
+        </w:rPr>
+      </w:pPr>
+      <w:r>
+        <w:rPr>
+          <w:b w:val="1"/>
+          <w:bCs w:val="1"/>
+          <w:rtl w:val="0"/>
+        </w:rPr>
+        <w:t xml:space="preserve">ACL-ek:</w:t>
+      </w:r>
+    </w:p>
+    <w:p>
+      <w:pPr>
+        <w:ind w:left="850.3937007874017" w:firstLine="0"/>
+        <w:rPr/>
+      </w:pPr>
+      <w:r>
+        <w:rPr>
+          <w:rtl w:val="0"/>
+        </w:rPr>
+      </w:r>
+    </w:p>
+    <w:p>
+      <w:pPr>
+        <w:ind w:left="850.3937007874017" w:firstLine="0"/>
+        <w:rPr/>
+      </w:pPr>
+      <w:r>
+        <w:rPr>
+          <w:rtl w:val="0"/>
+        </w:rPr>
+        <w:t xml:space="preserve">ASA0, HQ:</w:t>
+      </w:r>
+    </w:p>
+    <w:p>
+      <w:pPr>
+        <w:ind w:left="850.3937007874017" w:firstLine="0"/>
+        <w:rPr/>
+      </w:pPr>
+      <w:r>
+        <w:rPr>
+          <w:rtl w:val="0"/>
+        </w:rPr>
+      </w:r>
+    </w:p>
+    <w:p>
+      <w:pPr>
+        <w:ind w:left="850.3937007874017" w:firstLine="0"/>
+        <w:rPr/>
+      </w:pPr>
+      <w:r>
+        <w:rPr>
+          <w:rtl w:val="0"/>
+        </w:rPr>
+        <w:t xml:space="preserve">access-list VPN-NAT extended permit ip 10.10.0.0 255.255.0.0 192.168.88.0 255.255.255.0</w:t>
+      </w:r>
+    </w:p>
+    <w:p>
+      <w:pPr>
+        <w:ind w:left="850.3937007874017" w:firstLine="0"/>
+        <w:rPr/>
+      </w:pPr>
+      <w:r>
+        <w:rPr>
+          <w:rtl w:val="0"/>
+        </w:rPr>
+        <w:t xml:space="preserve">access-list VPN-NAT extended permit ip 192.168.0.0 255.255.224.0 192.168.88.0 255.255.255.0</w:t>
+      </w:r>
+    </w:p>
+    <w:p>
+      <w:pPr>
+        <w:ind w:left="850.3937007874017" w:firstLine="0"/>
+        <w:rPr/>
+      </w:pPr>
+      <w:r>
+        <w:rPr>
+          <w:rtl w:val="0"/>
+        </w:rPr>
+        <w:t xml:space="preserve">access-list OUTSIDE-IN extended permit tcp any host 203.0.113.2 eq www</w:t>
+      </w:r>
+    </w:p>
+    <w:p>
+      <w:pPr>
+        <w:ind w:left="850.3937007874017" w:firstLine="0"/>
+        <w:rPr/>
+      </w:pPr>
+      <w:r>
+        <w:rPr>
+          <w:rtl w:val="0"/>
+        </w:rPr>
+        <w:t xml:space="preserve">access-list OUTSIDE-IN extended permit ip 192.168.88.0 255.255.255.0 192.168.0.0 255.255.224.0</w:t>
+      </w:r>
+    </w:p>
+    <w:p>
+      <w:pPr>
+        <w:ind w:left="850.3937007874017" w:firstLine="0"/>
+        <w:rPr/>
+      </w:pPr>
+      <w:r>
+        <w:rPr>
+          <w:rtl w:val="0"/>
+        </w:rPr>
+        <w:t xml:space="preserve">access-list OUTSIDE-IN extended permit ip 192.168.88.0 255.255.255.0 10.10.0.0 255.255.0.0</w:t>
+      </w:r>
+    </w:p>
+    <w:p>
+      <w:pPr>
+        <w:ind w:left="850.3937007874017" w:firstLine="0"/>
+        <w:rPr/>
+      </w:pPr>
+      <w:r>
+        <w:rPr>
+          <w:rtl w:val="0"/>
+        </w:rPr>
+        <w:t xml:space="preserve">access-list OUTSIDE-IN extended permit icmp 203.0.113.0 255.255.255.0 any</w:t>
+      </w:r>
+    </w:p>
+    <w:p>
+      <w:pPr>
+        <w:ind w:left="850.3937007874017" w:firstLine="0"/>
+        <w:rPr/>
+      </w:pPr>
+      <w:r>
+        <w:rPr>
+          <w:rtl w:val="0"/>
+        </w:rPr>
+        <w:t xml:space="preserve">access-list OUTSIDE-IN extended permit udp 203.0.113.0 255.255.255.0 any eq isakmp</w:t>
+      </w:r>
+    </w:p>
+    <w:p>
+      <w:pPr>
+        <w:ind w:left="850.3937007874017" w:firstLine="0"/>
+        <w:rPr/>
+      </w:pPr>
+      <w:r>
+        <w:rPr>
+          <w:rtl w:val="0"/>
+        </w:rPr>
+        <w:t xml:space="preserve">access-list OUTSIDE-IN extended permit ip 203.0.113.0 255.255.255.0 any</w:t>
+      </w:r>
+    </w:p>
+    <w:p>
+      <w:pPr>
+        <w:ind w:left="850.3937007874017" w:firstLine="0"/>
+        <w:rPr/>
+      </w:pPr>
+      <w:r>
+        <w:rPr>
+          <w:rtl w:val="0"/>
+        </w:rPr>
+        <w:t xml:space="preserve">access-list VPN-ACL extended permit ip 10.10.0.0 255.255.0.0 192.168.88.0 255.255.255.0</w:t>
+      </w:r>
+    </w:p>
+    <w:p>
+      <w:pPr>
+        <w:ind w:left="850.3937007874017" w:firstLine="0"/>
+        <w:rPr/>
+      </w:pPr>
+      <w:r>
+        <w:rPr>
+          <w:rtl w:val="0"/>
+        </w:rPr>
+        <w:t xml:space="preserve">access-list VPN-ACL extended permit ip 192.168.0.0 255.255.224.0 192.168.88.0 255.255.255.0</w:t>
+      </w:r>
+    </w:p>
+    <w:p>
+      <w:pPr>
+        <w:ind w:left="850.3937007874017" w:firstLine="0"/>
+        <w:rPr/>
+      </w:pPr>
+      <w:r>
+        <w:rPr>
+          <w:rtl w:val="0"/>
+        </w:rPr>
+      </w:r>
+    </w:p>
+    <w:p>
+      <w:pPr>
+        <w:ind w:left="850.3937007874017" w:firstLine="0"/>
+        <w:rPr/>
+      </w:pPr>
+      <w:r>
+        <w:rPr>
+          <w:rtl w:val="0"/>
+        </w:rPr>
+        <w:t xml:space="preserve">ASA1, HomeOffice:</w:t>
+      </w:r>
+    </w:p>
+    <w:p>
+      <w:pPr>
+        <w:ind w:left="850.3937007874017" w:firstLine="0"/>
+        <w:rPr/>
+      </w:pPr>
+      <w:r>
+        <w:rPr>
+          <w:rtl w:val="0"/>
+        </w:rPr>
+      </w:r>
+    </w:p>
+    <w:p>
+      <w:pPr>
+        <w:ind w:left="850.3937007874017" w:firstLine="0"/>
+        <w:rPr/>
+      </w:pPr>
+      <w:r>
+        <w:rPr>
+          <w:rtl w:val="0"/>
+        </w:rPr>
+        <w:t xml:space="preserve">access-list VPN-NAT extended permit ip 192.168.88.0 255.255.255.0 10.10.0.0 255.255.0.0</w:t>
+      </w:r>
+    </w:p>
+    <w:p>
+      <w:pPr>
+        <w:ind w:left="850.3937007874017" w:firstLine="0"/>
+        <w:rPr/>
+      </w:pPr>
+      <w:r>
+        <w:rPr>
+          <w:rtl w:val="0"/>
+        </w:rPr>
+        <w:t xml:space="preserve">access-list VPN-NAT extended permit ip 192.168.88.0 255.255.255.0 192.168.0.0 255.255.224.0</w:t>
+      </w:r>
+    </w:p>
+    <w:p>
+      <w:pPr>
+        <w:ind w:left="850.3937007874017" w:firstLine="0"/>
+        <w:rPr/>
+      </w:pPr>
+      <w:r>
+        <w:rPr>
+          <w:rtl w:val="0"/>
+        </w:rPr>
+        <w:t xml:space="preserve">access-list OUTSIDE-IN extended permit ip 10.10.0.0 255.255.0.0 192.168.88.0 255.255.255.0</w:t>
+      </w:r>
+    </w:p>
+    <w:p>
+      <w:pPr>
+        <w:ind w:left="850.3937007874017" w:firstLine="0"/>
+        <w:rPr/>
+      </w:pPr>
+      <w:r>
+        <w:rPr>
+          <w:rtl w:val="0"/>
+        </w:rPr>
+        <w:t xml:space="preserve">access-list OUTSIDE-IN extended permit ip 192.168.0.0 255.255.224.0 192.168.88.0 255.255.255.0</w:t>
+      </w:r>
+    </w:p>
+    <w:p>
+      <w:pPr>
+        <w:ind w:left="850.3937007874017" w:firstLine="0"/>
+        <w:rPr/>
+      </w:pPr>
+      <w:r>
+        <w:rPr>
+          <w:rtl w:val="0"/>
+        </w:rPr>
+        <w:t xml:space="preserve">access-list OUTSIDE-IN extended permit icmp 203.0.113.0 255.255.255.0 any</w:t>
+      </w:r>
+    </w:p>
+    <w:p>
+      <w:pPr>
+        <w:ind w:left="850.3937007874017" w:firstLine="0"/>
+        <w:rPr/>
+      </w:pPr>
+      <w:r>
+        <w:rPr>
+          <w:rtl w:val="0"/>
+        </w:rPr>
+        <w:t xml:space="preserve">access-list OUTSIDE-IN extended permit udp 203.0.113.0 255.255.255.0 any eq isakmp</w:t>
+      </w:r>
+    </w:p>
+    <w:p>
+      <w:pPr>
+        <w:ind w:left="850.3937007874017" w:firstLine="0"/>
+        <w:rPr/>
+      </w:pPr>
+      <w:r>
+        <w:rPr>
+          <w:rtl w:val="0"/>
+        </w:rPr>
+        <w:t xml:space="preserve">access-list OUTSIDE-IN extended permit ip 203.0.113.0 255.255.255.0 any</w:t>
+      </w:r>
+    </w:p>
+    <w:p>
+      <w:pPr>
+        <w:ind w:left="850.3937007874017" w:firstLine="0"/>
+        <w:rPr/>
+      </w:pPr>
+      <w:r>
+        <w:rPr>
+          <w:rtl w:val="0"/>
+        </w:rPr>
+        <w:t xml:space="preserve">access-list VPN-ACL extended permit ip 192.168.88.0 255.255.255.0 10.10.0.0 255.255.0.0</w:t>
+      </w:r>
+    </w:p>
+    <w:p>
+      <w:pPr>
+        <w:ind w:left="850.3937007874017" w:firstLine="0"/>
+        <w:rPr/>
+      </w:pPr>
+      <w:r>
+        <w:rPr>
+          <w:rtl w:val="0"/>
+        </w:rPr>
+        <w:t xml:space="preserve">access-list VPN-ACL extended permit ip 192.168.88.0 255.255.255.0 192.168.0.0 255.255.224.0</w:t>
+      </w:r>
+    </w:p>
+    <w:p>
+      <w:pPr>
+        <w:ind w:left="850.3937007874017" w:firstLine="0"/>
+        <w:rPr/>
+      </w:pPr>
+      <w:r>
+        <w:rPr>
+          <w:rtl w:val="0"/>
+        </w:rPr>
+      </w:r>
+    </w:p>
+    <w:p>
+      <w:pPr>
+        <w:ind w:left="850.3937007874017" w:firstLine="0"/>
+        <w:rPr/>
+      </w:pPr>
+      <w:r>
+        <w:br w:type="page"/>
+      </w:r>
+      <w:r>
+        <w:rPr>
+          <w:rtl w:val="0"/>
+        </w:rPr>
+      </w:r>
+    </w:p>
+    <w:p>
+      <w:pPr>
+        <w:ind w:left="850.3937007874017" w:firstLine="0"/>
+        <w:rPr>
+          <w:b w:val="1"/>
+          <w:bCs w:val="1"/>
+        </w:rPr>
+      </w:pPr>
+      <w:r>
+        <w:rPr>
+          <w:b w:val="1"/>
+          <w:bCs w:val="1"/>
+          <w:rtl w:val="0"/>
+        </w:rPr>
+        <w:t xml:space="preserve">Szerverek:</w:t>
+      </w:r>
+    </w:p>
+    <w:p>
+      <w:pPr>
+        <w:ind w:left="850.3937007874017" w:firstLine="0"/>
+        <w:rPr/>
+      </w:pPr>
+      <w:r>
+        <w:rPr>
+          <w:rtl w:val="0"/>
+        </w:rPr>
+      </w:r>
+    </w:p>
+    <w:p>
+      <w:pPr>
+        <w:ind w:left="850.3937007874017" w:firstLine="0"/>
+        <w:rPr/>
+      </w:pPr>
+      <w:r>
+        <w:rPr>
+          <w:rtl w:val="0"/>
+        </w:rPr>
+        <w:t xml:space="preserve">Linux szerver, 192.168.10.20</w:t>
+      </w:r>
+    </w:p>
+    <w:p>
+      <w:pPr>
+        <w:ind w:left="850.3937007874017" w:firstLine="0"/>
+        <w:rPr/>
+      </w:pPr>
+      <w:r>
+        <w:rPr>
+          <w:rtl w:val="0"/>
+        </w:rPr>
+      </w:r>
+    </w:p>
+    <w:p>
+      <w:pPr>
+        <w:ind w:left="850.3937007874017" w:firstLine="0"/>
+        <w:rPr/>
+      </w:pPr>
+      <w:r>
+        <w:rPr>
+          <w:rtl w:val="0"/>
+        </w:rPr>
+        <w:t xml:space="preserve">Windows szerver, 192.168.10.21</w:t>
+      </w:r>
+      <w:r>
+        <w:rPr>
+          <w:rtl w:val="0"/>
+        </w:rPr>
       </w:r>
     </w:p>
     <w:p>

</xml_diff>